<commit_message>
docs: add live render links and deployment screenshots to report and README
</commit_message>
<xml_diff>
--- a/assignment02/report/BAO_CAO_A02.docx
+++ b/assignment02/report/BAO_CAO_A02.docx
@@ -10321,6 +10321,769 @@
       </w:r>
     </w:p>
     <w:p>
+      <w:pPr>
+        <w:jc w:val="center"/>
+      </w:pPr>
+      <w:r>
+        <w:rPr>
+          <w:noProof/>
+        </w:rPr>
+        <w:lastRenderedPageBreak/>
+        <w:drawing>
+          <wp:inline distT="0" distB="0" distL="0" distR="0">
+            <wp:extent cx="5580000" cy="3516897"/>
+            <wp:effectExtent l="0" t="0" r="0" b="0"/>
+            <wp:docPr id="17" name="Picture 17"/>
+            <wp:cNvGraphicFramePr>
+              <a:graphicFrameLocks xmlns:a="http://schemas.openxmlformats.org/drawingml/2006/main" noChangeAspect="1"/>
+            </wp:cNvGraphicFramePr>
+            <a:graphic xmlns:a="http://schemas.openxmlformats.org/drawingml/2006/main">
+              <a:graphicData uri="http://schemas.openxmlformats.org/drawingml/2006/picture">
+                <pic:pic xmlns:pic="http://schemas.openxmlformats.org/drawingml/2006/picture">
+                  <pic:nvPicPr>
+                    <pic:cNvPr id="0" name="render_web_diabetes.png"/>
+                    <pic:cNvPicPr/>
+                  </pic:nvPicPr>
+                  <pic:blipFill>
+                    <a:blip r:embed="rId22"/>
+                    <a:stretch>
+                      <a:fillRect/>
+                    </a:stretch>
+                  </pic:blipFill>
+                  <pic:spPr>
+                    <a:xfrm>
+                      <a:off x="0" y="0"/>
+                      <a:ext cx="5580000" cy="3516897"/>
+                    </a:xfrm>
+                    <a:prstGeom prst="rect">
+                      <a:avLst/>
+                    </a:prstGeom>
+                  </pic:spPr>
+                </pic:pic>
+              </a:graphicData>
+            </a:graphic>
+          </wp:inline>
+        </w:drawing>
+      </w:r>
+    </w:p>
+    <w:p>
+      <w:pPr>
+        <w:jc w:val="center"/>
+      </w:pPr>
+      <w:r>
+        <w:rPr>
+          <w:i/>
+          <w:sz w:val="20"/>
+        </w:rPr>
+        <w:t>Hình 7.2 — Web app Diabetes ĐÃ DEPLOY trên Render (URL công khai, g</w:t>
+      </w:r>
+      <w:r>
+        <w:rPr>
+          <w:i/>
+          <w:sz w:val="20"/>
+        </w:rPr>
+        <w:t>ọ</w:t>
+      </w:r>
+      <w:r>
+        <w:rPr>
+          <w:i/>
+          <w:sz w:val="20"/>
+        </w:rPr>
+        <w:t>i API th</w:t>
+      </w:r>
+      <w:r>
+        <w:rPr>
+          <w:i/>
+          <w:sz w:val="20"/>
+        </w:rPr>
+        <w:t>ậ</w:t>
+      </w:r>
+      <w:r>
+        <w:rPr>
+          <w:i/>
+          <w:sz w:val="20"/>
+        </w:rPr>
+        <w:t>t)</w:t>
+      </w:r>
+    </w:p>
+    <w:p>
+      <w:pPr>
+        <w:jc w:val="center"/>
+      </w:pPr>
+      <w:r>
+        <w:rPr>
+          <w:noProof/>
+        </w:rPr>
+        <w:lastRenderedPageBreak/>
+        <w:drawing>
+          <wp:inline distT="0" distB="0" distL="0" distR="0">
+            <wp:extent cx="2880000" cy="6232615"/>
+            <wp:effectExtent l="0" t="0" r="0" b="0"/>
+            <wp:docPr id="18" name="Picture 18"/>
+            <wp:cNvGraphicFramePr>
+              <a:graphicFrameLocks xmlns:a="http://schemas.openxmlformats.org/drawingml/2006/main" noChangeAspect="1"/>
+            </wp:cNvGraphicFramePr>
+            <a:graphic xmlns:a="http://schemas.openxmlformats.org/drawingml/2006/main">
+              <a:graphicData uri="http://schemas.openxmlformats.org/drawingml/2006/picture">
+                <pic:pic xmlns:pic="http://schemas.openxmlformats.org/drawingml/2006/picture">
+                  <pic:nvPicPr>
+                    <pic:cNvPr id="0" name="render_mobile_diabetes.png"/>
+                    <pic:cNvPicPr/>
+                  </pic:nvPicPr>
+                  <pic:blipFill>
+                    <a:blip r:embed="rId23"/>
+                    <a:stretch>
+                      <a:fillRect/>
+                    </a:stretch>
+                  </pic:blipFill>
+                  <pic:spPr>
+                    <a:xfrm>
+                      <a:off x="0" y="0"/>
+                      <a:ext cx="2880000" cy="6232615"/>
+                    </a:xfrm>
+                    <a:prstGeom prst="rect">
+                      <a:avLst/>
+                    </a:prstGeom>
+                  </pic:spPr>
+                </pic:pic>
+              </a:graphicData>
+            </a:graphic>
+          </wp:inline>
+        </w:drawing>
+      </w:r>
+    </w:p>
+    <w:p>
+      <w:pPr>
+        <w:jc w:val="center"/>
+      </w:pPr>
+      <w:r>
+        <w:rPr>
+          <w:i/>
+          <w:sz w:val="20"/>
+        </w:rPr>
+        <w:t>Hình 7.3 — Mobile app Diabetes trên Render: d</w:t>
+      </w:r>
+      <w:r>
+        <w:rPr>
+          <w:i/>
+          <w:sz w:val="20"/>
+        </w:rPr>
+        <w:t>ự</w:t>
+      </w:r>
+      <w:r>
+        <w:rPr>
+          <w:i/>
+          <w:sz w:val="20"/>
+        </w:rPr>
+        <w:t xml:space="preserve"> đoán CÓ TI</w:t>
+      </w:r>
+      <w:r>
+        <w:rPr>
+          <w:i/>
+          <w:sz w:val="20"/>
+        </w:rPr>
+        <w:t>Ể</w:t>
+      </w:r>
+      <w:r>
+        <w:rPr>
+          <w:i/>
+          <w:sz w:val="20"/>
+        </w:rPr>
+        <w:t>U ĐƯ</w:t>
+      </w:r>
+      <w:r>
+        <w:rPr>
+          <w:i/>
+          <w:sz w:val="20"/>
+        </w:rPr>
+        <w:t>Ờ</w:t>
+      </w:r>
+      <w:r>
+        <w:rPr>
+          <w:i/>
+          <w:sz w:val="20"/>
+        </w:rPr>
+        <w:t>NG 90.0%</w:t>
+      </w:r>
+    </w:p>
+    <w:p>
+      <w:pPr>
+        <w:jc w:val="center"/>
+      </w:pPr>
+      <w:r>
+        <w:rPr>
+          <w:noProof/>
+        </w:rPr>
+        <w:lastRenderedPageBreak/>
+        <w:drawing>
+          <wp:inline distT="0" distB="0" distL="0" distR="0">
+            <wp:extent cx="5580000" cy="3923438"/>
+            <wp:effectExtent l="0" t="0" r="0" b="0"/>
+            <wp:docPr id="19" name="Picture 19"/>
+            <wp:cNvGraphicFramePr>
+              <a:graphicFrameLocks xmlns:a="http://schemas.openxmlformats.org/drawingml/2006/main" noChangeAspect="1"/>
+            </wp:cNvGraphicFramePr>
+            <a:graphic xmlns:a="http://schemas.openxmlformats.org/drawingml/2006/main">
+              <a:graphicData uri="http://schemas.openxmlformats.org/drawingml/2006/picture">
+                <pic:pic xmlns:pic="http://schemas.openxmlformats.org/drawingml/2006/picture">
+                  <pic:nvPicPr>
+                    <pic:cNvPr id="0" name="render_web_house.png"/>
+                    <pic:cNvPicPr/>
+                  </pic:nvPicPr>
+                  <pic:blipFill>
+                    <a:blip r:embed="rId24"/>
+                    <a:stretch>
+                      <a:fillRect/>
+                    </a:stretch>
+                  </pic:blipFill>
+                  <pic:spPr>
+                    <a:xfrm>
+                      <a:off x="0" y="0"/>
+                      <a:ext cx="5580000" cy="3923438"/>
+                    </a:xfrm>
+                    <a:prstGeom prst="rect">
+                      <a:avLst/>
+                    </a:prstGeom>
+                  </pic:spPr>
+                </pic:pic>
+              </a:graphicData>
+            </a:graphic>
+          </wp:inline>
+        </w:drawing>
+      </w:r>
+    </w:p>
+    <w:p>
+      <w:pPr>
+        <w:jc w:val="center"/>
+      </w:pPr>
+      <w:r>
+        <w:rPr>
+          <w:i/>
+          <w:sz w:val="20"/>
+        </w:rPr>
+        <w:t>Hình 7.4 — Web app House Price trên Render</w:t>
+      </w:r>
+      <w:r>
+        <w:rPr>
+          <w:i/>
+          <w:sz w:val="20"/>
+        </w:rPr>
+        <w:t>: đ</w:t>
+      </w:r>
+      <w:r>
+        <w:rPr>
+          <w:i/>
+          <w:sz w:val="20"/>
+        </w:rPr>
+        <w:t>ị</w:t>
+      </w:r>
+      <w:r>
+        <w:rPr>
+          <w:i/>
+          <w:sz w:val="20"/>
+        </w:rPr>
+        <w:t>nh giá nhà qua API công khai</w:t>
+      </w:r>
+    </w:p>
+    <w:p>
+      <w:pPr>
+        <w:jc w:val="center"/>
+      </w:pPr>
+      <w:r>
+        <w:rPr>
+          <w:noProof/>
+        </w:rPr>
+        <w:lastRenderedPageBreak/>
+        <w:drawing>
+          <wp:inline distT="0" distB="0" distL="0" distR="0">
+            <wp:extent cx="2880000" cy="6232615"/>
+            <wp:effectExtent l="0" t="0" r="0" b="0"/>
+            <wp:docPr id="20" name="Picture 20"/>
+            <wp:cNvGraphicFramePr>
+              <a:graphicFrameLocks xmlns:a="http://schemas.openxmlformats.org/drawingml/2006/main" noChangeAspect="1"/>
+            </wp:cNvGraphicFramePr>
+            <a:graphic xmlns:a="http://schemas.openxmlformats.org/drawingml/2006/main">
+              <a:graphicData uri="http://schemas.openxmlformats.org/drawingml/2006/picture">
+                <pic:pic xmlns:pic="http://schemas.openxmlformats.org/drawingml/2006/picture">
+                  <pic:nvPicPr>
+                    <pic:cNvPr id="0" name="mobile_house_02_result.png"/>
+                    <pic:cNvPicPr/>
+                  </pic:nvPicPr>
+                  <pic:blipFill>
+                    <a:blip r:embed="rId15"/>
+                    <a:stretch>
+                      <a:fillRect/>
+                    </a:stretch>
+                  </pic:blipFill>
+                  <pic:spPr>
+                    <a:xfrm>
+                      <a:off x="0" y="0"/>
+                      <a:ext cx="2880000" cy="6232615"/>
+                    </a:xfrm>
+                    <a:prstGeom prst="rect">
+                      <a:avLst/>
+                    </a:prstGeom>
+                  </pic:spPr>
+                </pic:pic>
+              </a:graphicData>
+            </a:graphic>
+          </wp:inline>
+        </w:drawing>
+      </w:r>
+    </w:p>
+    <w:p>
+      <w:pPr>
+        <w:jc w:val="center"/>
+      </w:pPr>
+      <w:r>
+        <w:rPr>
+          <w:i/>
+          <w:sz w:val="20"/>
+        </w:rPr>
+        <w:t>Hình 7.5 — Mobile House Price trên Render</w:t>
+      </w:r>
+    </w:p>
+    <w:p>
+      <w:pPr>
+        <w:jc w:val="center"/>
+      </w:pPr>
+      <w:r>
+        <w:rPr>
+          <w:noProof/>
+        </w:rPr>
+        <w:lastRenderedPageBreak/>
+        <w:drawing>
+          <wp:inline distT="0" distB="0" distL="0" distR="0">
+            <wp:extent cx="5580000" cy="3923438"/>
+            <wp:effectExtent l="0" t="0" r="0" b="0"/>
+            <wp:docPr id="21" name="Picture 21"/>
+            <wp:cNvGraphicFramePr>
+              <a:graphicFrameLocks xmlns:a="http://schemas.openxmlformats.org/drawingml/2006/main" noChangeAspect="1"/>
+            </wp:cNvGraphicFramePr>
+            <a:graphic xmlns:a="http://schemas.openxmlformats.org/drawingml/2006/main">
+              <a:graphicData uri="http://schemas.openxmlformats.org/drawingml/2006/picture">
+                <pic:pic xmlns:pic="http://schemas.openxmlformats.org/drawingml/2006/picture">
+                  <pic:nvPicPr>
+                    <pic:cNvPr id="0" name="render_web_customer.png"/>
+                    <pic:cNvPicPr/>
+                  </pic:nvPicPr>
+                  <pic:blipFill>
+                    <a:blip r:embed="rId25"/>
+                    <a:stretch>
+                      <a:fillRect/>
+                    </a:stretch>
+                  </pic:blipFill>
+                  <pic:spPr>
+                    <a:xfrm>
+                      <a:off x="0" y="0"/>
+                      <a:ext cx="5580000" cy="3923438"/>
+                    </a:xfrm>
+                    <a:prstGeom prst="rect">
+                      <a:avLst/>
+                    </a:prstGeom>
+                  </pic:spPr>
+                </pic:pic>
+              </a:graphicData>
+            </a:graphic>
+          </wp:inline>
+        </w:drawing>
+      </w:r>
+    </w:p>
+    <w:p>
+      <w:pPr>
+        <w:jc w:val="center"/>
+      </w:pPr>
+      <w:r>
+        <w:rPr>
+          <w:i/>
+          <w:sz w:val="20"/>
+        </w:rPr>
+        <w:t>Hình 7.6 — Web app Customer Behavior trên Render</w:t>
+      </w:r>
+    </w:p>
+    <w:p>
+      <w:pPr>
+        <w:jc w:val="center"/>
+      </w:pPr>
+      <w:r>
+        <w:rPr>
+          <w:noProof/>
+        </w:rPr>
+        <w:lastRenderedPageBreak/>
+        <w:drawing>
+          <wp:inline distT="0" distB="0" distL="0" distR="0">
+            <wp:extent cx="2880000" cy="6232615"/>
+            <wp:effectExtent l="0" t="0" r="0" b="0"/>
+            <wp:docPr id="22" name="Picture 22"/>
+            <wp:cNvGraphicFramePr>
+              <a:graphicFrameLocks xmlns:a="http://schemas.openxmlformats.org/drawingml/2006/main" noChangeAspect="1"/>
+            </wp:cNvGraphicFramePr>
+            <a:graphic xmlns:a="http://schemas.openxmlformats.org/drawingml/2006/main">
+              <a:graphicData uri="http://schemas.openxmlformats.org/drawingml/2006/picture">
+                <pic:pic xmlns:pic="http://schemas.openxmlformats.org/drawingml/2006/picture">
+                  <pic:nvPicPr>
+                    <pic:cNvPr id="0" name="mobile_customer_02_result.png"/>
+                    <pic:cNvPicPr/>
+                  </pic:nvPicPr>
+                  <pic:blipFill>
+                    <a:blip r:embed="rId20"/>
+                    <a:stretch>
+                      <a:fillRect/>
+                    </a:stretch>
+                  </pic:blipFill>
+                  <pic:spPr>
+                    <a:xfrm>
+                      <a:off x="0" y="0"/>
+                      <a:ext cx="2880000" cy="6232615"/>
+                    </a:xfrm>
+                    <a:prstGeom prst="rect">
+                      <a:avLst/>
+                    </a:prstGeom>
+                  </pic:spPr>
+                </pic:pic>
+              </a:graphicData>
+            </a:graphic>
+          </wp:inline>
+        </w:drawing>
+      </w:r>
+    </w:p>
+    <w:p>
+      <w:pPr>
+        <w:jc w:val="center"/>
+      </w:pPr>
+      <w:r>
+        <w:rPr>
+          <w:i/>
+          <w:sz w:val="20"/>
+        </w:rPr>
+        <w:t>Hình 7.7 — Mobile Customer trên Render: interest + top-3</w:t>
+      </w:r>
+    </w:p>
+    <w:p>
+      <w:r>
+        <w:rPr>
+          <w:b/>
+        </w:rPr>
+        <w:t>Link công khai đã deploy (Render free, Singapore — t</w:t>
+      </w:r>
+      <w:r>
+        <w:rPr>
+          <w:b/>
+        </w:rPr>
+        <w:t>ự</w:t>
+      </w:r>
+      <w:r>
+        <w:rPr>
+          <w:b/>
+        </w:rPr>
+        <w:t xml:space="preserve"> th</w:t>
+      </w:r>
+      <w:r>
+        <w:rPr>
+          <w:b/>
+        </w:rPr>
+        <w:t>ứ</w:t>
+      </w:r>
+      <w:r>
+        <w:rPr>
+          <w:b/>
+        </w:rPr>
+        <w:t>c d</w:t>
+      </w:r>
+      <w:r>
+        <w:rPr>
+          <w:b/>
+        </w:rPr>
+        <w:t>ậ</w:t>
+      </w:r>
+      <w:r>
+        <w:rPr>
+          <w:b/>
+        </w:rPr>
+        <w:t>y sau ~5</w:t>
+      </w:r>
+      <w:r>
+        <w:rPr>
+          <w:b/>
+        </w:rPr>
+        <w:t>0s n</w:t>
+      </w:r>
+      <w:r>
+        <w:rPr>
+          <w:b/>
+        </w:rPr>
+        <w:t>ế</w:t>
+      </w:r>
+      <w:r>
+        <w:rPr>
+          <w:b/>
+        </w:rPr>
+        <w:t>u ng</w:t>
+      </w:r>
+      <w:r>
+        <w:rPr>
+          <w:b/>
+        </w:rPr>
+        <w:t>ủ</w:t>
+      </w:r>
+      <w:r>
+        <w:rPr>
+          <w:b/>
+        </w:rPr>
+        <w:t>):</w:t>
+      </w:r>
+    </w:p>
+    <w:tbl>
+      <w:tblPr>
+        <w:tblStyle w:val="TableGrid"/>
+        <w:tblW w:w="0" w:type="auto"/>
+        <w:jc w:val="center"/>
+        <w:tblLook w:val="04A0" w:firstRow="1" w:lastRow="0" w:firstColumn="1" w:lastColumn="0" w:noHBand="0" w:noVBand="1"/>
+      </w:tblPr>
+      <w:tblGrid>
+        <w:gridCol w:w="2880"/>
+        <w:gridCol w:w="2880"/>
+        <w:gridCol w:w="2880"/>
+      </w:tblGrid>
+      <w:tr>
+        <w:trPr>
+          <w:jc w:val="center"/>
+        </w:trPr>
+        <w:tc>
+          <w:tcPr>
+            <w:tcW w:w="2880" w:type="dxa"/>
+          </w:tcPr>
+          <w:p>
+            <w:r>
+              <w:rPr>
+                <w:b/>
+                <w:sz w:val="20"/>
+              </w:rPr>
+              <w:t>H</w:t>
+            </w:r>
+            <w:r>
+              <w:rPr>
+                <w:b/>
+                <w:sz w:val="20"/>
+              </w:rPr>
+              <w:t>ệ</w:t>
+            </w:r>
+            <w:r>
+              <w:rPr>
+                <w:b/>
+                <w:sz w:val="20"/>
+              </w:rPr>
+              <w:t xml:space="preserve"> th</w:t>
+            </w:r>
+            <w:r>
+              <w:rPr>
+                <w:b/>
+                <w:sz w:val="20"/>
+              </w:rPr>
+              <w:t>ố</w:t>
+            </w:r>
+            <w:r>
+              <w:rPr>
+                <w:b/>
+                <w:sz w:val="20"/>
+              </w:rPr>
+              <w:t>ng</w:t>
+            </w:r>
+          </w:p>
+        </w:tc>
+        <w:tc>
+          <w:tcPr>
+            <w:tcW w:w="2880" w:type="dxa"/>
+          </w:tcPr>
+          <w:p>
+            <w:r>
+              <w:rPr>
+                <w:b/>
+                <w:sz w:val="20"/>
+              </w:rPr>
+              <w:t>Web</w:t>
+            </w:r>
+          </w:p>
+        </w:tc>
+        <w:tc>
+          <w:tcPr>
+            <w:tcW w:w="2880" w:type="dxa"/>
+          </w:tcPr>
+          <w:p>
+            <w:r>
+              <w:rPr>
+                <w:b/>
+                <w:sz w:val="20"/>
+              </w:rPr>
+              <w:t>API (Swagger)</w:t>
+            </w:r>
+          </w:p>
+        </w:tc>
+      </w:tr>
+      <w:tr>
+        <w:trPr>
+          <w:jc w:val="center"/>
+        </w:trPr>
+        <w:tc>
+          <w:tcPr>
+            <w:tcW w:w="2880" w:type="dxa"/>
+          </w:tcPr>
+          <w:p>
+            <w:r>
+              <w:rPr>
+                <w:sz w:val="20"/>
+              </w:rPr>
+              <w:t>Diabetes</w:t>
+            </w:r>
+          </w:p>
+        </w:tc>
+        <w:tc>
+          <w:tcPr>
+            <w:tcW w:w="2880" w:type="dxa"/>
+          </w:tcPr>
+          <w:p>
+            <w:r>
+              <w:rPr>
+                <w:sz w:val="20"/>
+              </w:rPr>
+              <w:t>https://diabetes-web-0jv0.onrender.com</w:t>
+            </w:r>
+          </w:p>
+        </w:tc>
+        <w:tc>
+          <w:tcPr>
+            <w:tcW w:w="2880" w:type="dxa"/>
+          </w:tcPr>
+          <w:p>
+            <w:r>
+              <w:rPr>
+                <w:sz w:val="20"/>
+              </w:rPr>
+              <w:t>https://diabetes-api-4991.onrender.com</w:t>
+            </w:r>
+          </w:p>
+        </w:tc>
+      </w:tr>
+      <w:tr>
+        <w:trPr>
+          <w:jc w:val="center"/>
+        </w:trPr>
+        <w:tc>
+          <w:tcPr>
+            <w:tcW w:w="2880" w:type="dxa"/>
+          </w:tcPr>
+          <w:p>
+            <w:r>
+              <w:rPr>
+                <w:sz w:val="20"/>
+              </w:rPr>
+              <w:t>House Price</w:t>
+            </w:r>
+          </w:p>
+        </w:tc>
+        <w:tc>
+          <w:tcPr>
+            <w:tcW w:w="2880" w:type="dxa"/>
+          </w:tcPr>
+          <w:p>
+            <w:r>
+              <w:rPr>
+                <w:sz w:val="20"/>
+              </w:rPr>
+              <w:t>https://house-web-0g9o.onrender.com</w:t>
+            </w:r>
+          </w:p>
+        </w:tc>
+        <w:tc>
+          <w:tcPr>
+            <w:tcW w:w="2880" w:type="dxa"/>
+          </w:tcPr>
+          <w:p>
+            <w:r>
+              <w:rPr>
+                <w:sz w:val="20"/>
+              </w:rPr>
+              <w:t>https://house-api-odk5.onrender.com</w:t>
+            </w:r>
+          </w:p>
+        </w:tc>
+      </w:tr>
+      <w:tr>
+        <w:trPr>
+          <w:jc w:val="center"/>
+        </w:trPr>
+        <w:tc>
+          <w:tcPr>
+            <w:tcW w:w="2880" w:type="dxa"/>
+          </w:tcPr>
+          <w:p>
+            <w:r>
+              <w:rPr>
+                <w:sz w:val="20"/>
+              </w:rPr>
+              <w:t>Customer</w:t>
+            </w:r>
+          </w:p>
+        </w:tc>
+        <w:tc>
+          <w:tcPr>
+            <w:tcW w:w="2880" w:type="dxa"/>
+          </w:tcPr>
+          <w:p>
+            <w:r>
+              <w:rPr>
+                <w:sz w:val="20"/>
+              </w:rPr>
+              <w:t>https://customer-web-eocp.onrender.com</w:t>
+            </w:r>
+          </w:p>
+        </w:tc>
+        <w:tc>
+          <w:tcPr>
+            <w:tcW w:w="2880" w:type="dxa"/>
+          </w:tcPr>
+          <w:p>
+            <w:r>
+              <w:rPr>
+                <w:sz w:val="20"/>
+              </w:rPr>
+              <w:t>https://customer-api-8is4.onrender.com</w:t>
+            </w:r>
+          </w:p>
+        </w:tc>
+      </w:tr>
+    </w:tbl>
+    <w:p/>
+    <w:p>
+      <w:r>
+        <w:t>Mobile: m</w:t>
+      </w:r>
+      <w:r>
+        <w:t>ở</w:t>
+      </w:r>
+      <w:r>
+        <w:t xml:space="preserve"> &lt;api-url&gt;/mobile trên đi</w:t>
+      </w:r>
+      <w:r>
+        <w:t>ệ</w:t>
+      </w:r>
+      <w:r>
+        <w:t>n tho</w:t>
+      </w:r>
+      <w:r>
+        <w:t>ạ</w:t>
+      </w:r>
+      <w:r>
+        <w:t>i (host ngay trong API service, g</w:t>
+      </w:r>
+      <w:r>
+        <w:t>ọ</w:t>
+      </w:r>
+      <w:r>
+        <w:t>i same-origin).</w:t>
+      </w:r>
+    </w:p>
+    <w:p>
       <w:r>
         <w:br w:type="page"/>
       </w:r>
@@ -10345,7 +11108,10 @@
         <w:t>ờ</w:t>
       </w:r>
       <w:r>
-        <w:t>i lăm câu chung (tr</w:t>
+        <w:t>i lăm câu chung (</w:t>
+      </w:r>
+      <w:r>
+        <w:t>tr</w:t>
       </w:r>
       <w:r>
         <w:t>ả</w:t>
@@ -10412,10 +11178,7 @@
         <w:t>ộ</w:t>
       </w:r>
       <w:r>
-        <w:t xml:space="preserve">p </w:t>
-      </w:r>
-      <w:r>
-        <w:t>t</w:t>
+        <w:t>p t</w:t>
       </w:r>
       <w:r>
         <w:t>ừ</w:t>
@@ -10478,7 +11241,13 @@
         <w:rPr>
           <w:b/>
         </w:rPr>
-        <w:t>3. Final numerical representation?</w:t>
+        <w:t>3. Final</w:t>
+      </w:r>
+      <w:r>
+        <w:rPr>
+          <w:b/>
+        </w:rPr>
+        <w:t xml:space="preserve"> numerical representation?</w:t>
       </w:r>
     </w:p>
     <w:p>
@@ -10515,13 +11284,7 @@
         <w:rPr>
           <w:b/>
         </w:rPr>
-        <w:t xml:space="preserve">a </w:t>
-      </w:r>
-      <w:r>
-        <w:rPr>
-          <w:b/>
-        </w:rPr>
-        <w:t>feature matrix nghĩa gì?</w:t>
+        <w:t>a feature matrix nghĩa gì?</w:t>
       </w:r>
     </w:p>
     <w:p>
@@ -10594,7 +11357,13 @@
         <w:rPr>
           <w:b/>
         </w:rPr>
-        <w:t>5. Feature nào c</w:t>
+        <w:t>5. Feature</w:t>
+      </w:r>
+      <w:r>
+        <w:rPr>
+          <w:b/>
+        </w:rPr>
+        <w:t xml:space="preserve"> nào c</w:t>
       </w:r>
       <w:r>
         <w:rPr>
@@ -10631,13 +11400,7 @@
         <w:rPr>
           <w:b/>
         </w:rPr>
-        <w:t xml:space="preserve">n </w:t>
-      </w:r>
-      <w:r>
-        <w:rPr>
-          <w:b/>
-        </w:rPr>
-        <w:t>normalization?</w:t>
+        <w:t>n normalization?</w:t>
       </w:r>
     </w:p>
     <w:p>
@@ -10685,7 +11448,10 @@
         <w:t>ế</w:t>
       </w:r>
       <w:r>
-        <w:t xml:space="preserve"> missing (0 = không đo vs th</w:t>
+        <w:t xml:space="preserve"> missing (0 =</w:t>
+      </w:r>
+      <w:r>
+        <w:t xml:space="preserve"> không đo vs th</w:t>
       </w:r>
       <w:r>
         <w:t>ậ</w:t>
@@ -10751,10 +11517,7 @@
         <w:t>ấ</w:t>
       </w:r>
       <w:r>
-        <w:t>u t</w:t>
-      </w:r>
-      <w:r>
-        <w:t>rúc ng</w:t>
+        <w:t>u trúc ng</w:t>
       </w:r>
       <w:r>
         <w:t>ữ</w:t>
@@ -10894,10 +11657,7 @@
         <w:t>ệ</w:t>
       </w:r>
       <w:r>
-        <w:t xml:space="preserve">u thay </w:t>
-      </w:r>
-      <w:r>
-        <w:t>vì train; category revenue share (A3) sinh ra target; cho model nhìn val/test khi ch</w:t>
+        <w:t>u thay vì train; category revenue share (A3) sinh ra target; cho model nhìn val/test khi ch</w:t>
       </w:r>
       <w:r>
         <w:t>ọ</w:t>
@@ -10921,7 +11681,10 @@
         <w:t>ọ</w:t>
       </w:r>
       <w:r>
-        <w:t>n model trên val, test ch</w:t>
+        <w:t>n model trên val,</w:t>
+      </w:r>
+      <w:r>
+        <w:t xml:space="preserve"> test ch</w:t>
       </w:r>
       <w:r>
         <w:t>ỉ</w:t>
@@ -10979,13 +11742,7 @@
         <w:rPr>
           <w:b/>
         </w:rPr>
-        <w:t xml:space="preserve">11. </w:t>
-      </w:r>
-      <w:r>
-        <w:rPr>
-          <w:b/>
-        </w:rPr>
-        <w:t>Vì sao ch</w:t>
+        <w:t>11. Vì sao ch</w:t>
       </w:r>
       <w:r>
         <w:rPr>
@@ -11040,7 +11797,13 @@
         <w:rPr>
           <w:b/>
         </w:rPr>
-        <w:t>12. Metric quan tr</w:t>
+        <w:t>12. Metric q</w:t>
+      </w:r>
+      <w:r>
+        <w:rPr>
+          <w:b/>
+        </w:rPr>
+        <w:t>uan tr</w:t>
       </w:r>
       <w:r>
         <w:rPr>
@@ -11117,10 +11880,7 @@
         <w:t>ằ</w:t>
       </w:r>
       <w:r>
-        <w:t>ng)</w:t>
-      </w:r>
-      <w:r>
-        <w:t>.</w:t>
+        <w:t>ng).</w:t>
       </w:r>
     </w:p>
     <w:p>
@@ -11189,7 +11949,13 @@
         <w:rPr>
           <w:b/>
         </w:rPr>
-        <w:t>14. Web dùng persisted model th</w:t>
+        <w:t>14. Web dùng persisted</w:t>
+      </w:r>
+      <w:r>
+        <w:rPr>
+          <w:b/>
+        </w:rPr>
+        <w:t xml:space="preserve"> model th</w:t>
       </w:r>
       <w:r>
         <w:rPr>
@@ -11230,10 +11996,7 @@
         <w:t>ồ</w:t>
       </w:r>
       <w:r>
-        <w:t>i predict</w:t>
-      </w:r>
-      <w:r>
-        <w:t>.</w:t>
+        <w:t>i predict.</w:t>
       </w:r>
     </w:p>
     <w:p>
@@ -11294,7 +12057,10 @@
         <w:t>ị</w:t>
       </w:r>
       <w:r>
-        <w:t xml:space="preserve"> kèm di</w:t>
+        <w:t xml:space="preserve"> </w:t>
+      </w:r>
+      <w:r>
+        <w:t>kèm di</w:t>
       </w:r>
       <w:r>
         <w:t>ễ</w:t>
@@ -11375,10 +12141,7 @@
         <w:t>ừ</w:t>
       </w:r>
       <w:r>
-        <w:t xml:space="preserve"> khóa</w:t>
-      </w:r>
-      <w:r>
-        <w:t xml:space="preserve"> lo</w:t>
+        <w:t xml:space="preserve"> khóa lo</w:t>
       </w:r>
       <w:r>
         <w:t>ạ</w:t>
@@ -11445,7 +12208,10 @@
         <w:t>ộ</w:t>
       </w:r>
       <w:r>
-        <w:t>p Description theo khách thành basket_text → tokens → token IDs → tr</w:t>
+        <w:t>p Description theo khách thành basket_text → tokens → token</w:t>
+      </w:r>
+      <w:r>
+        <w:t xml:space="preserve"> IDs → tr</w:t>
       </w:r>
       <w:r>
         <w:t>ọ</w:t>
@@ -11500,10 +12266,7 @@
         <w:t>ừ</w:t>
       </w:r>
       <w:r>
-        <w:t xml:space="preserve"> tr</w:t>
-      </w:r>
-      <w:r>
-        <w:t>ain — không mang giá tr</w:t>
+        <w:t xml:space="preserve"> train — không mang giá tr</w:t>
       </w:r>
       <w:r>
         <w:t>ị</w:t>
@@ -11576,7 +12339,10 @@
         <w:t>ố</w:t>
       </w:r>
       <w:r>
-        <w:t xml:space="preserve"> TF-IDF cao nghĩa là khách mua lo</w:t>
+        <w:t xml:space="preserve"> TF-IDF</w:t>
+      </w:r>
+      <w:r>
+        <w:t xml:space="preserve"> cao nghĩa là khách mua lo</w:t>
       </w:r>
       <w:r>
         <w:t>ạ</w:t>
@@ -11651,13 +12417,7 @@
         <w:rPr>
           <w:b/>
         </w:rPr>
-        <w:t xml:space="preserve">c </w:t>
-      </w:r>
-      <w:r>
-        <w:rPr>
-          <w:b/>
-        </w:rPr>
-        <w:t>interest nào?</w:t>
+        <w:t>c interest nào?</w:t>
       </w:r>
     </w:p>
     <w:p>
@@ -11670,7 +12430,13 @@
         <w:rPr>
           <w:b/>
         </w:rPr>
-        <w:t>6. Text có c</w:t>
+        <w:t>6. T</w:t>
+      </w:r>
+      <w:r>
+        <w:rPr>
+          <w:b/>
+        </w:rPr>
+        <w:t>ext có c</w:t>
       </w:r>
       <w:r>
         <w:rPr>
@@ -11735,10 +12501,7 @@
         <w:t>ử</w:t>
       </w:r>
       <w:r>
-        <w:t xml:space="preserve"> (RF 0.163→0.291; SVM 0.109→0.309; L</w:t>
-      </w:r>
-      <w:r>
-        <w:t>R 0.083→0.276).</w:t>
+        <w:t xml:space="preserve"> (RF 0.163→0.291; SVM 0.109→0.309; LR 0.083→0.276).</w:t>
       </w:r>
     </w:p>
     <w:p>
@@ -11883,7 +12646,13 @@
               <w:rPr>
                 <w:sz w:val="20"/>
               </w:rPr>
-              <w:t>scikit-learn 1.9.0, pandas 2.x, numpy 1.26+, fastapi 0.141, streamlit, sentence-transformers 6.0 (ch</w:t>
+              <w:t>scikit-learn 1.9.0, pandas 2.</w:t>
+            </w:r>
+            <w:r>
+              <w:rPr>
+                <w:sz w:val="20"/>
+              </w:rPr>
+              <w:t>x, numpy 1.26+, fastapi 0.141, streamlit, sentence-transformers 6.0 (ch</w:t>
             </w:r>
             <w:r>
               <w:rPr>
@@ -11986,13 +12755,7 @@
               <w:rPr>
                 <w:sz w:val="20"/>
               </w:rPr>
-              <w:t xml:space="preserve">i </w:t>
-            </w:r>
-            <w:r>
-              <w:rPr>
-                <w:sz w:val="20"/>
-              </w:rPr>
-              <w:t>ch</w:t>
+              <w:t>i ch</w:t>
             </w:r>
             <w:r>
               <w:rPr>
@@ -12090,7 +12853,13 @@
               <w:rPr>
                 <w:sz w:val="20"/>
               </w:rPr>
-              <w:t>i local trong &lt;app&gt;/data/ — ch</w:t>
+              <w:t xml:space="preserve">i local trong </w:t>
+            </w:r>
+            <w:r>
+              <w:rPr>
+                <w:sz w:val="20"/>
+              </w:rPr>
+              <w:t>&lt;app&gt;/data/ — ch</w:t>
             </w:r>
             <w:r>
               <w:rPr>
@@ -12181,13 +12950,7 @@
               <w:rPr>
                 <w:sz w:val="20"/>
               </w:rPr>
-              <w:t>ng _build.py — cell-by-</w:t>
-            </w:r>
-            <w:r>
-              <w:rPr>
-                <w:sz w:val="20"/>
-              </w:rPr>
-              <w:t>cell tái l</w:t>
+              <w:t>ng _build.py — cell-by-cell tái l</w:t>
             </w:r>
             <w:r>
               <w:rPr>
@@ -12285,7 +13048,13 @@
               <w:rPr>
                 <w:sz w:val="20"/>
               </w:rPr>
-              <w:t>n trong &lt;app&gt;/api, &lt;app&gt;/web, &lt;app&gt;/mobile; deploy script deploy/deploy-all.py</w:t>
+              <w:t xml:space="preserve">n trong </w:t>
+            </w:r>
+            <w:r>
+              <w:rPr>
+                <w:sz w:val="20"/>
+              </w:rPr>
+              <w:t>&lt;app&gt;/api, &lt;app&gt;/web, &lt;app&gt;/mobile; deploy script deploy/deploy-all.py</w:t>
             </w:r>
           </w:p>
         </w:tc>
@@ -12323,10 +13092,7 @@
         <w:t>ố</w:t>
       </w:r>
       <w:r>
-        <w:t>ng thông</w:t>
-      </w:r>
-      <w:r>
-        <w:t xml:space="preserve"> minh không ph</w:t>
+        <w:t>ng thông minh không ph</w:t>
       </w:r>
       <w:r>
         <w:t>ả</w:t>
@@ -12356,7 +13122,10 @@
         <w:t>ấ</w:t>
       </w:r>
       <w:r>
-        <w:t>t quán, trong đó representation là m</w:t>
+        <w:t xml:space="preserve">t quán, trong </w:t>
+      </w:r>
+      <w:r>
+        <w:t>đó representation là m</w:t>
       </w:r>
       <w:r>
         <w:t>ắ</w:t>
@@ -12454,10 +13223,7 @@
         <w:t>ậ</w:t>
       </w:r>
       <w:r>
-        <w:t>t (0-trá h</w:t>
-      </w:r>
-      <w:r>
-        <w:t>ình y t</w:t>
+        <w:t>t (0-trá hình y t</w:t>
       </w:r>
       <w:r>
         <w:t>ế</w:t>
@@ -12513,7 +13279,10 @@
         <w:t>ọ</w:t>
       </w:r>
       <w:r>
-        <w:t>ng nh</w:t>
+        <w:t>ng</w:t>
+      </w:r>
+      <w:r>
+        <w:t xml:space="preserve"> nh</w:t>
       </w:r>
       <w:r>
         <w:t>ấ</w:t>
@@ -12573,10 +13342,7 @@
         <w:t>ầ</w:t>
       </w:r>
       <w:r>
-        <w:t>n RF; on</w:t>
-      </w:r>
-      <w:r>
-        <w:t>e-hot zipcode + log-target giúp GB đ</w:t>
+        <w:t>n RF; one-hot zipcode + log-target giúp GB đ</w:t>
       </w:r>
       <w:r>
         <w:t>ạ</w:t>
@@ -12608,7 +13374,10 @@
         <w:t>ể</w:t>
       </w:r>
       <w:r>
-        <w:t>n khai, không theo accuracy đơn thu</w:t>
+        <w:t>n kh</w:t>
+      </w:r>
+      <w:r>
+        <w:t>ai, không theo accuracy đơn thu</w:t>
       </w:r>
       <w:r>
         <w:t>ầ</w:t>
@@ -12658,10 +13427,7 @@
         <w:t>ả</w:t>
       </w:r>
       <w:r>
-        <w:t xml:space="preserve"> training và serving; </w:t>
-      </w:r>
-      <w:r>
-        <w:t>web và mobile cùng dùng m</w:t>
+        <w:t xml:space="preserve"> training và serving; web và mobile cùng dùng m</w:t>
       </w:r>
       <w:r>
         <w:t>ộ</w:t>
@@ -12736,7 +13502,10 @@
         <w:t>ẩ</w:t>
       </w:r>
       <w:r>
-        <w:t>m thay keyword rules; (2) neural embedding (MiniLM/TF-IDF hybrid) làm feature chính; (3) thu thêm d</w:t>
+        <w:t>m thay keyword r</w:t>
+      </w:r>
+      <w:r>
+        <w:t>ules; (2) neural embedding (MiniLM/TF-IDF hybrid) làm feature chính; (3) thu thêm d</w:t>
       </w:r>
       <w:r>
         <w:t>ữ</w:t>
@@ -12760,10 +13529,7 @@
         <w:t>ế</w:t>
       </w:r>
       <w:r>
-        <w:t>m; (4) giám sát drif</w:t>
-      </w:r>
-      <w:r>
-        <w:t>t khi serving.</w:t>
+        <w:t>m; (4) giám sát drift khi serving.</w:t>
       </w:r>
     </w:p>
     <w:sectPr>
@@ -24685,7 +25451,7 @@
 </file>
 
 <file path=customXml/itemProps1.xml><?xml version="1.0" encoding="utf-8"?>
-<ds:datastoreItem xmlns:ds="http://schemas.openxmlformats.org/officeDocument/2006/customXml" ds:itemID="{E9A3B4C8-CDE7-4280-9157-FB6B54182197}">
+<ds:datastoreItem xmlns:ds="http://schemas.openxmlformats.org/officeDocument/2006/customXml" ds:itemID="{AEB8C771-C2A9-40F5-8AC0-66D063AF07D8}">
   <ds:schemaRefs>
     <ds:schemaRef ds:uri="http://schemas.openxmlformats.org/officeDocument/2006/bibliography"/>
   </ds:schemaRefs>

</xml_diff>